<commit_message>
add new file 3
</commit_message>
<xml_diff>
--- a/21321.docx
+++ b/21321.docx
@@ -4,7 +4,10 @@
   <w:body>
     <w:p>
       <w:r>
-        <w:t xml:space="preserve">Privetik blin </w:t>
+        <w:t>Privetik blin</w:t>
+      </w:r>
+      <w:r>
+        <w:t xml:space="preserve"> blinskiy</w:t>
       </w:r>
     </w:p>
     <w:sectPr>

</xml_diff>